<commit_message>
Remove ablation code and obsolete artifacts
</commit_message>
<xml_diff>
--- a/reports/mlearn_power_report_polished_updated.docx
+++ b/reports/mlearn_power_report_polished_updated.docx
@@ -11330,9 +11330,9 @@
         </w:rPr>
         <w:t>。</w:t>
         <w:br/>
-        <w:t>正式脚本 SHA256：262f0405845635d3468e66c279066944019588900e257acdc356d6c7680c4fd1</w:t>
+        <w:t>正式脚本 SHA256：7e39285ac06adf351b8e00e33a52d9814e7ae9c3a06c07e0071a840bf3688be8</w:t>
         <w:br/>
-        <w:t>实验签名：8e78be2f38d9acfe19d9b02677fb4fe355bb1f6bc1175c82a10ec379655e7971</w:t>
+        <w:t>实验签名：ae5564dd00ec121828f818b7889b19eaff141d2f9691fd6bbdb219c5e78ea2f6</w:t>
         <w:br/>
         <w:t>仓库中的 README、结果 CSV、运行元数据、数据切分清单和天气月份映射可用于复核本报告。</w:t>
       </w:r>

</xml_diff>